<commit_message>
edit kegiatan, hapus foto, update template
Co-authored-by: Copilot <copilot@github.com>
</commit_message>
<xml_diff>
--- a/resources/templates/template_laporan.docx
+++ b/resources/templates/template_laporan.docx
@@ -3948,7 +3948,7 @@
                   </wp:anchor>
                 </w:drawing>
               </mc:Choice>
-              <mc:Fallback xmlns:w16du="http://schemas.microsoft.com/office/word/2023/wordml/word16du" xmlns:oel="http://schemas.microsoft.com/office/2019/extlst">
+              <mc:Fallback xmlns:oel="http://schemas.microsoft.com/office/2019/extlst" xmlns:w16du="http://schemas.microsoft.com/office/word/2023/wordml/word16du">
                 <w:pict>
                   <v:group w14:anchorId="14F2871A" id="Group 4" o:spid="_x0000_s1026" style="position:absolute;margin-left:-48.2pt;margin-top:-28.35pt;width:168pt;height:789.5pt;z-index:-251657216;mso-height-relative:margin" coordsize="21336,91257" o:gfxdata="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">
                     <v:rect id="Rectangle 2" o:spid="_x0000_s1027" style="position:absolute;width:1945;height:91257;visibility:visible;mso-wrap-style:square;v-text-anchor:middle" o:gfxdata="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" fillcolor="#44546a [3215]" stroked="f" strokeweight="1pt"/>
@@ -5089,7 +5089,25 @@
                                     <w:sz w:val="24"/>
                                     <w:szCs w:val="20"/>
                                   </w:rPr>
-                                  <w:t>Fax. 6338402, 6340527 Website : pemadam.jakarta.go.id</w:t>
+                                  <w:t xml:space="preserve">Fax. 6338402, 6340527 </w:t>
+                                </w:r>
+                                <w:proofErr w:type="gramStart"/>
+                                <w:r>
+                                  <w:rPr>
+                                    <w:b/>
+                                    <w:sz w:val="24"/>
+                                    <w:szCs w:val="20"/>
+                                  </w:rPr>
+                                  <w:t>Website :</w:t>
+                                </w:r>
+                                <w:proofErr w:type="gramEnd"/>
+                                <w:r>
+                                  <w:rPr>
+                                    <w:b/>
+                                    <w:sz w:val="24"/>
+                                    <w:szCs w:val="20"/>
+                                  </w:rPr>
+                                  <w:t xml:space="preserve"> pemadam.jakarta.go.id</w:t>
                                 </w:r>
                               </w:p>
                             </w:txbxContent>
@@ -8304,6 +8322,7 @@
         </w:rPr>
       </w:pPr>
       <w:proofErr w:type="spellStart"/>
+      <w:proofErr w:type="gramStart"/>
       <w:r>
         <w:rPr>
           <w:rFonts w:ascii="Arial" w:hAnsi="Arial" w:cs="Arial"/>
@@ -8321,6 +8340,7 @@
         </w:rPr>
         <w:t xml:space="preserve"> :</w:t>
       </w:r>
+      <w:proofErr w:type="gramEnd"/>
       <w:r>
         <w:rPr>
           <w:rFonts w:ascii="Arial" w:hAnsi="Arial" w:cs="Arial"/>
@@ -9180,97 +9200,33 @@
           <w:sz w:val="24"/>
           <w:szCs w:val="24"/>
         </w:rPr>
-        <w:t xml:space="preserve"> Kinerja </w:t>
-      </w:r>
-      <w:proofErr w:type="spellStart"/>
+        <w:t xml:space="preserve"> Kinerja</w:t>
+      </w:r>
       <w:r>
         <w:rPr>
           <w:rFonts w:ascii="Arial" w:hAnsi="Arial" w:cs="Arial"/>
           <w:sz w:val="24"/>
           <w:szCs w:val="24"/>
         </w:rPr>
-        <w:t>Pengelola</w:t>
-      </w:r>
-      <w:proofErr w:type="spellEnd"/>
+        <w:t xml:space="preserve"> ${</w:t>
+      </w:r>
+      <w:proofErr w:type="spellStart"/>
       <w:r>
         <w:rPr>
           <w:rFonts w:ascii="Arial" w:hAnsi="Arial" w:cs="Arial"/>
           <w:sz w:val="24"/>
           <w:szCs w:val="24"/>
         </w:rPr>
-        <w:t xml:space="preserve"> </w:t>
-      </w:r>
-      <w:proofErr w:type="spellStart"/>
+        <w:t>nama_kontrak</w:t>
+      </w:r>
+      <w:proofErr w:type="spellEnd"/>
       <w:r>
         <w:rPr>
           <w:rFonts w:ascii="Arial" w:hAnsi="Arial" w:cs="Arial"/>
           <w:sz w:val="24"/>
           <w:szCs w:val="24"/>
         </w:rPr>
-        <w:t>Jaringan</w:t>
-      </w:r>
-      <w:proofErr w:type="spellEnd"/>
-      <w:r>
-        <w:rPr>
-          <w:rFonts w:ascii="Arial" w:hAnsi="Arial" w:cs="Arial"/>
-          <w:sz w:val="24"/>
-          <w:szCs w:val="24"/>
-        </w:rPr>
-        <w:t xml:space="preserve"> dan </w:t>
-      </w:r>
-      <w:proofErr w:type="spellStart"/>
-      <w:r>
-        <w:rPr>
-          <w:rFonts w:ascii="Arial" w:hAnsi="Arial" w:cs="Arial"/>
-          <w:sz w:val="24"/>
-          <w:szCs w:val="24"/>
-        </w:rPr>
-        <w:t>Infrastuktur</w:t>
-      </w:r>
-      <w:proofErr w:type="spellEnd"/>
-      <w:r>
-        <w:rPr>
-          <w:rFonts w:ascii="Arial" w:hAnsi="Arial" w:cs="Arial"/>
-          <w:sz w:val="24"/>
-          <w:szCs w:val="24"/>
-        </w:rPr>
-        <w:t xml:space="preserve"> </w:t>
-      </w:r>
-      <w:proofErr w:type="spellStart"/>
-      <w:r>
-        <w:rPr>
-          <w:rFonts w:ascii="Arial" w:hAnsi="Arial" w:cs="Arial"/>
-          <w:sz w:val="24"/>
-          <w:szCs w:val="24"/>
-        </w:rPr>
-        <w:t>Sistem</w:t>
-      </w:r>
-      <w:proofErr w:type="spellEnd"/>
-      <w:r>
-        <w:rPr>
-          <w:rFonts w:ascii="Arial" w:hAnsi="Arial" w:cs="Arial"/>
-          <w:sz w:val="24"/>
-          <w:szCs w:val="24"/>
-        </w:rPr>
-        <w:t xml:space="preserve"> </w:t>
-      </w:r>
-      <w:proofErr w:type="spellStart"/>
-      <w:r>
-        <w:rPr>
-          <w:rFonts w:ascii="Arial" w:hAnsi="Arial" w:cs="Arial"/>
-          <w:sz w:val="24"/>
-          <w:szCs w:val="24"/>
-        </w:rPr>
-        <w:t>Informasi</w:t>
-      </w:r>
-      <w:proofErr w:type="spellEnd"/>
-      <w:r>
-        <w:rPr>
-          <w:rFonts w:ascii="Arial" w:hAnsi="Arial" w:cs="Arial"/>
-          <w:sz w:val="24"/>
-          <w:szCs w:val="24"/>
-        </w:rPr>
-        <w:t xml:space="preserve"> (Programmer)</w:t>
+        <w:t>}</w:t>
       </w:r>
       <w:r>
         <w:rPr>

</xml_diff>